<commit_message>
v7: Konsolidierung - aktualisierte Praesentation (10 Slides, ohne PyCaret, Gamma-Badge entfernt) + erweiterte Doku
Praesentation neu generiert mit konsolidierten Ergebnissen (Clustering-3D, Anomalie, SHAP),
'Made with Gamma'-Logo aus dem PPTX-Layout entfernt. Doku um Schritte 12-15 (Anomalie,
Ensembles, SHAP, AutoML) und zusammenfassende Ergebnisse erweitert. README-Gamma-Link aktualisiert.
</commit_message>
<xml_diff>
--- a/dokumentation/Dokumentation_Nachvollziehbare_Schritte_Predictive_Maintenance_AS.docx
+++ b/dokumentation/Dokumentation_Nachvollziehbare_Schritte_Predictive_Maintenance_AS.docx
@@ -1804,6 +1804,100 @@
     <w:p>
       <w:r>
         <w:br w:type="page"/>
+      </w:r>
+    </w:p>
+    <w:p>
+      <w:pPr>
+        <w:pStyle w:val="Heading3"/>
+      </w:pPr>
+      <w:r>
+        <w:t>12)</w:t>
+        <w:tab/>
+        <w:t>Ausreißer- und Anomalie-Erkennung (unüberwacht)</w:t>
+      </w:r>
+    </w:p>
+    <w:p>
+      <w:pPr/>
+      <w:r>
+        <w:t>Das überwachte Modell benötigt gelabelte Ausfälle. In der Praxis fehlen diese oft — eine neue Anlage hat noch keine Ausfall-Historie. Deshalb wurde zusätzlich eine unüberwachte Anomalie-Erkennung umgesetzt (Notebook 16), die auffällige Maschinen allein aus den standardisierten Merkmalen findet — ganz ohne Labels.</w:t>
+      </w:r>
+    </w:p>
+    <w:p>
+      <w:pPr/>
+      <w:r>
+        <w:t>Eingesetzt wurden Isolation Forest, Local Outlier Factor (LOF) und Elliptic Envelope, jeweils mit einer erwarteten Anomalie-Quote in Höhe der bekannten Ausfallrate (3,4 %). Zur Validierung wurden die Labels erst NACH dem Training herangezogen: Die als anomal markierten Maschinen treffen echte Ausfälle deutlich über Zufallsniveau (Isolation Forest: Precision 0,33 gegenüber einer Basisrate von 0,034, ROC-AUC 0,86 — also rund zehnmal besser als Zufall).</w:t>
+      </w:r>
+    </w:p>
+    <w:p>
+      <w:pPr/>
+      <w:r>
+        <w:t>Nutzen: Anomalie-Erkennung ist als erste Frühwarn-Linie sofort einsetzbar (Cold-Start), bevor überhaupt Trainingsdaten mit Ausfall-Labels existieren.</w:t>
+      </w:r>
+    </w:p>
+    <w:p>
+      <w:pPr>
+        <w:pStyle w:val="Heading3"/>
+      </w:pPr>
+      <w:r>
+        <w:t>13)</w:t>
+        <w:tab/>
+        <w:t>Ensemble-Vergleich: Bagging, Boosting und Stacking</w:t>
+      </w:r>
+    </w:p>
+    <w:p>
+      <w:pPr/>
+      <w:r>
+        <w:t>Um das Ensemble-Kapitel vollständig abzubilden, wurden die Verfahren entlang ihrer Logik verglichen (Notebook 17): ein einzelner Decision Tree, dann Bagging (Random Forest), dann Boosting (XGBoost) und schließlich Stacking (Kombination aus Logistischer Regression, Random Forest und XGBoost mit einem Meta-Modell).</w:t>
+      </w:r>
+    </w:p>
+    <w:p>
+      <w:pPr/>
+      <w:r>
+        <w:t>Die Ergebnisse (PR-AUC auf dem Holdout-Test) bestätigen die Theorie: Decision Tree 0,77, Random Forest 0,87, XGBoost 0,89, Stacking 0,88. Bagging senkt die Varianz des Einzelbaums deutlich, Boosting holt durch sequentielles Korrigieren das Maximum heraus, und Stacking bringt hier nur noch einen kleinen Zugewinn — mehr Komplexität bedeutet nicht automatisch mehr Leistung.</w:t>
+      </w:r>
+    </w:p>
+    <w:p>
+      <w:pPr>
+        <w:pStyle w:val="Heading3"/>
+      </w:pPr>
+      <w:r>
+        <w:t>14)</w:t>
+        <w:tab/>
+        <w:t>Erklärbarkeit: Permutation Importance und SHAP</w:t>
+      </w:r>
+    </w:p>
+    <w:p>
+      <w:pPr/>
+      <w:r>
+        <w:t>Ein Modell ist nur dann eine belastbare Entscheidungsgrundlage, wenn nachvollziehbar ist, warum es eine Vorhersage trifft. Zwei Ebenen wurden umgesetzt (Notebook 17): Permutation Importance zeigt global, welche Merkmale am wichtigsten sind (kurs-konform), und SHAP zerlegt jede einzelne Vorhersage in die Beiträge der Features (Erweiterung über den Kursstoff hinaus).</w:t>
+      </w:r>
+    </w:p>
+    <w:p>
+      <w:pPr/>
+      <w:r>
+        <w:t>Für eine konkrete Risiko-Maschine treiben hoher Werkzeugverschleiß in Kombination mit hohem Drehmoment, die Drehzahl und die mechanische Leistung das Risiko nach oben — physikalisch plausibel. Das Modell ist damit keine Black Box, sondern liefert begründbare Empfehlungen.</w:t>
+      </w:r>
+    </w:p>
+    <w:p>
+      <w:pPr>
+        <w:pStyle w:val="Heading3"/>
+      </w:pPr>
+      <w:r>
+        <w:t>15)</w:t>
+        <w:tab/>
+        <w:t>AutoML-Benchmark mit PyCaret</w:t>
+      </w:r>
+    </w:p>
+    <w:p>
+      <w:pPr/>
+      <w:r>
+        <w:t>Abschließend wurde das handgebaute, mit Optuna getunte Modell gegen eine automatische ML-Pipeline (PyCaret) verglichen (Notebook 18). PyCaret lief in einer isolierten Umgebung, da es ältere Paketversionen verlangt; das Projekt-Environment blieb dadurch unberührt.</w:t>
+      </w:r>
+    </w:p>
+    <w:p>
+      <w:pPr/>
+      <w:r>
+        <w:t>Auch AutoML landet bei einem Boosting-Verfahren (Sieger LightGBM, AUC 0,97) und kommt damit nah an das handgetunte XGBoost (ROC-AUC 0,98) heran. Besonders lehrreich ist der Dummy-Classifier: 96,6 % Accuracy bei einer AUC von 0,5 und einem Recall von 0 % — der unabhängige Beweis, warum in diesem Projekt konsequent auf Recall und PR-AUC statt auf Accuracy optimiert wurde.</w:t>
       </w:r>
     </w:p>
     <w:p>
@@ -2566,6 +2660,12 @@
       </w:r>
     </w:p>
     <w:p>
+      <w:pPr/>
+      <w:r>
+        <w:t>Die Erweiterungen bestätigen das Kernergebnis aus mehreren Richtungen: Sowohl das unüberwachte Clustering und die Anomalie-Erkennung als auch der AutoML-Benchmark identifizieren dieselben Risikotreiber (hohe mechanische Last) wie das überwachte Modell. Die SHAP-Analyse macht diese Treiber pro Einzelfall transparent. Das finale, mit Optuna getunte XGBoost bleibt das beste Modell (ROC-AUC 0,98) und erkennt bei recall-optimiertem Schwellenwert 62 von 68 echten Ausfällen.</w:t>
+      </w:r>
+    </w:p>
+    <w:p>
       <w:pPr>
         <w:pStyle w:val="Heading1"/>
       </w:pPr>

</xml_diff>